<commit_message>
Add Martabe WIs batch 14 (detox analyser calibration, moisture analyser verification)
Co-Authored-By: Claude Sonnet 5.5 <noreply@anthropic.com>
Claude-Session: https://claude.ai/code/session_0121qocWgsZdFAsne2oz9sHT
</commit_message>
<xml_diff>
--- a/SWI/204-Physical-Testwork/MM-4034-033-OR-03-SWI-PRO-MET-204-006-Moisture-Content-Determination-RevA.docx
+++ b/SWI/204-Physical-Testwork/MM-4034-033-OR-03-SWI-PRO-MET-204-006-Moisture-Content-Determination-RevA.docx
@@ -602,6 +602,60 @@
       <w:pPr>
         <w:spacing w:after="100" w:before="0" w:line="245"/>
       </w:pPr>
+    </w:p>
+    <w:tbl>
+      <w:tblPr>
+        <w:tblW w:type="dxa" w:w="9026"/>
+        <w:tblBorders>
+          <w:left w:val="single" w:color="B7791F" w:sz="18"/>
+        </w:tblBorders>
+        <w:tblCellMar>
+          <w:top w:type="dxa" w:w="90"/>
+          <w:left w:type="dxa" w:w="150"/>
+          <w:bottom w:type="dxa" w:w="90"/>
+          <w:right w:type="dxa" w:w="120"/>
+        </w:tblCellMar>
+      </w:tblPr>
+      <w:tblGrid>
+        <w:gridCol w:w="9026"/>
+      </w:tblGrid>
+      <w:tr>
+        <w:tc>
+          <w:tcPr>
+            <w:tcW w:type="dxa" w:w="9026"/>
+            <w:shd w:val="clear" w:color="auto" w:fill="FFF4D6"/>
+          </w:tcPr>
+          <w:p>
+            <w:pPr>
+              <w:spacing w:after="0" w:before="0" w:line="245"/>
+            </w:pPr>
+            <w:r>
+              <w:rPr>
+                <w:rFonts w:ascii="Calibri" w:cs="Calibri" w:eastAsia="Calibri" w:hAnsi="Calibri"/>
+                <w:b/>
+                <w:bCs/>
+                <w:color w:val="7A4B00"/>
+                <w:sz w:val="17"/>
+                <w:szCs w:val="17"/>
+              </w:rPr>
+              <w:t xml:space="preserve">DRAFT FOR REVIEW. Martabe work instruction 'A&amp;D MS-70 Moisture Analyzer Calibration' (DOC-3-MET-PMC-WIN-00121-IE, v1.0, issued 25/12/2024) added as Section 6 Part B. Not approved until reviewed. JSEA JSEA-PRO-MET-204-006 must be updated for the added hazard row.</w:t>
+            </w:r>
+          </w:p>
+        </w:tc>
+      </w:tr>
+    </w:tbl>
+    <w:p>
+      <w:pPr>
+        <w:spacing w:after="60" w:before="0" w:line="245"/>
+      </w:pPr>
+      <w:r>
+        <w:rPr>
+          <w:rFonts w:ascii="Calibri" w:cs="Calibri" w:eastAsia="Calibri" w:hAnsi="Calibri"/>
+          <w:sz w:val="17"/>
+          <w:szCs w:val="17"/>
+        </w:rPr>
+        <w:t xml:space="preserve"/>
+      </w:r>
     </w:p>
     <w:p>
       <w:pPr>
@@ -1268,6 +1322,56 @@
           </w:p>
         </w:tc>
       </w:tr>
+      <w:tr>
+        <w:tc>
+          <w:tcPr>
+            <w:tcW w:type="dxa" w:w="2900"/>
+            <w:tcMar>
+              <w:top w:type="dxa" w:w="55"/>
+              <w:left w:type="dxa" w:w="85"/>
+              <w:bottom w:type="dxa" w:w="55"/>
+              <w:right w:type="dxa" w:w="85"/>
+            </w:tcMar>
+          </w:tcPr>
+          <w:p>
+            <w:pPr>
+              <w:spacing w:after="0" w:line="235"/>
+            </w:pPr>
+            <w:r>
+              <w:rPr>
+                <w:rFonts w:ascii="Calibri" w:cs="Calibri" w:eastAsia="Calibri" w:hAnsi="Calibri"/>
+                <w:sz w:val="16"/>
+                <w:szCs w:val="16"/>
+              </w:rPr>
+              <w:t xml:space="preserve">[JSEA to confirm] Hot surface and pinch point on the moisture analyser, material dust, and manual handling</w:t>
+            </w:r>
+          </w:p>
+        </w:tc>
+        <w:tc>
+          <w:tcPr>
+            <w:tcW w:type="dxa" w:w="6126"/>
+            <w:tcMar>
+              <w:top w:type="dxa" w:w="55"/>
+              <w:left w:type="dxa" w:w="85"/>
+              <w:bottom w:type="dxa" w:w="55"/>
+              <w:right w:type="dxa" w:w="85"/>
+            </w:tcMar>
+          </w:tcPr>
+          <w:p>
+            <w:pPr>
+              <w:spacing w:after="0" w:line="235"/>
+            </w:pPr>
+            <w:r>
+              <w:rPr>
+                <w:rFonts w:ascii="Calibri" w:cs="Calibri" w:eastAsia="Calibri" w:hAnsi="Calibri"/>
+                <w:sz w:val="16"/>
+                <w:szCs w:val="16"/>
+              </w:rPr>
+              <w:t xml:space="preserve">Cloth gloves for the hot pan and heater; keep hands clear of the cover pinch point and do not hurry. N95 mask for the powder and latex gloves for skin irritation. Ergonomic posture when handling weights.</w:t>
+            </w:r>
+          </w:p>
+        </w:tc>
+      </w:tr>
     </w:tbl>
     <w:p>
       <w:pPr>
@@ -1729,6 +1833,24 @@
     </w:p>
     <w:p>
       <w:pPr>
+        <w:pStyle w:val="ListParagraph"/>
+        <w:numPr>
+          <w:ilvl w:val="0"/>
+          <w:numId w:val="1"/>
+        </w:numPr>
+        <w:spacing w:after="60" w:line="245"/>
+      </w:pPr>
+      <w:r>
+        <w:rPr>
+          <w:rFonts w:ascii="Calibri" w:cs="Calibri" w:eastAsia="Calibri" w:hAnsi="Calibri"/>
+          <w:sz w:val="17"/>
+          <w:szCs w:val="17"/>
+        </w:rPr>
+        <w:t xml:space="preserve">[M] A&amp;D MS-70 moisture analyser (Martabe filtration plant instrument), 20 g and 50 g calibration weights, scoop, sodium tartrate dihydrate, N95 mask, latex and cloth gloves</w:t>
+      </w:r>
+    </w:p>
+    <w:p>
+      <w:pPr>
         <w:pStyle w:val="Heading1"/>
         <w:spacing w:after="120" w:before="260"/>
       </w:pPr>
@@ -1746,6 +1868,23 @@
     </w:p>
     <w:p>
       <w:pPr>
+        <w:spacing w:after="90" w:before="180" w:line="245"/>
+        <w:keepNext/>
+      </w:pPr>
+      <w:r>
+        <w:rPr>
+          <w:rFonts w:ascii="Calibri" w:cs="Calibri" w:eastAsia="Calibri" w:hAnsi="Calibri"/>
+          <w:b/>
+          <w:bCs/>
+          <w:color w:val="1F3864"/>
+          <w:sz w:val="19"/>
+          <w:szCs w:val="19"/>
+        </w:rPr>
+        <w:t xml:space="preserve">Part A - Moisture by oven drying to constant mass</w:t>
+      </w:r>
+    </w:p>
+    <w:p>
+      <w:pPr>
         <w:ind w:left="280"/>
         <w:spacing w:after="50" w:before="0" w:line="245"/>
       </w:pPr>
@@ -1910,6 +2049,337 @@
           <w:szCs w:val="17"/>
         </w:rPr>
         <w:t xml:space="preserve">  Record the oven temperature, the drying period and the balance identity.</w:t>
+      </w:r>
+    </w:p>
+    <w:p>
+      <w:pPr>
+        <w:spacing w:after="90" w:before="180" w:line="245"/>
+        <w:keepNext/>
+      </w:pPr>
+      <w:r>
+        <w:rPr>
+          <w:rFonts w:ascii="Calibri" w:cs="Calibri" w:eastAsia="Calibri" w:hAnsi="Calibri"/>
+          <w:b/>
+          <w:bCs/>
+          <w:color w:val="1F3864"/>
+          <w:sz w:val="19"/>
+          <w:szCs w:val="19"/>
+        </w:rPr>
+        <w:t xml:space="preserve">Part B - Moisture analyser verification: weight and per cent moisture [M]</w:t>
+      </w:r>
+    </w:p>
+    <w:p>
+      <w:pPr>
+        <w:spacing w:after="60" w:before="0" w:line="245"/>
+      </w:pPr>
+      <w:r>
+        <w:rPr>
+          <w:rFonts w:ascii="Calibri" w:cs="Calibri" w:eastAsia="Calibri" w:hAnsi="Calibri"/>
+          <w:sz w:val="17"/>
+          <w:szCs w:val="17"/>
+        </w:rPr>
+        <w:t xml:space="preserve">[M] = taken from the Martabe team work instruction "A&amp;D MS-70 Moisture Analyzer Calibration (DOC-3-MET-PMC-WIN-00121-IE)" (25/12/2024). [CONFIRM] = unspecified or inconsistent in the source; resolve before this instruction is approved for use. Part A (oven method) is unchanged and remains the reference method.</w:t>
+      </w:r>
+    </w:p>
+    <w:p>
+      <w:pPr>
+        <w:spacing w:after="60" w:before="0" w:line="245"/>
+      </w:pPr>
+      <w:r>
+        <w:rPr>
+          <w:rFonts w:ascii="Calibri" w:cs="Calibri" w:eastAsia="Calibri" w:hAnsi="Calibri"/>
+          <w:sz w:val="17"/>
+          <w:szCs w:val="17"/>
+        </w:rPr>
+        <w:t xml:space="preserve">[CONFIRM] the source is for the A&amp;D MS-70 moisture analyser. Section 5 lists no moisture analyser; confirm one is held and which model.</w:t>
+      </w:r>
+    </w:p>
+    <w:p>
+      <w:pPr>
+        <w:ind w:left="280"/>
+        <w:spacing w:after="50" w:before="0" w:line="245"/>
+      </w:pPr>
+      <w:r>
+        <w:rPr>
+          <w:rFonts w:ascii="Calibri" w:cs="Calibri" w:eastAsia="Calibri" w:hAnsi="Calibri"/>
+          <w:b/>
+          <w:bCs/>
+          <w:sz w:val="17"/>
+          <w:szCs w:val="17"/>
+        </w:rPr>
+        <w:t xml:space="preserve">8.</w:t>
+      </w:r>
+      <w:r>
+        <w:rPr>
+          <w:rFonts w:ascii="Calibri" w:cs="Calibri" w:eastAsia="Calibri" w:hAnsi="Calibri"/>
+          <w:sz w:val="17"/>
+          <w:szCs w:val="17"/>
+        </w:rPr>
+        <w:t xml:space="preserve">  Take 5 and prepare the 20 g and 50 g calibration weights. Check the equipment is in good condition [M].</w:t>
+      </w:r>
+    </w:p>
+    <w:p>
+      <w:pPr>
+        <w:ind w:left="280"/>
+        <w:spacing w:after="50" w:before="0" w:line="245"/>
+      </w:pPr>
+      <w:r>
+        <w:rPr>
+          <w:rFonts w:ascii="Calibri" w:cs="Calibri" w:eastAsia="Calibri" w:hAnsi="Calibri"/>
+          <w:b/>
+          <w:bCs/>
+          <w:sz w:val="17"/>
+          <w:szCs w:val="17"/>
+        </w:rPr>
+        <w:t xml:space="preserve">9.</w:t>
+      </w:r>
+      <w:r>
+        <w:rPr>
+          <w:rFonts w:ascii="Calibri" w:cs="Calibri" w:eastAsia="Calibri" w:hAnsi="Calibri"/>
+          <w:sz w:val="17"/>
+          <w:szCs w:val="17"/>
+        </w:rPr>
+        <w:t xml:space="preserve">  Weight verification: make sure the moisture analyser is not damaged and is fit for use, then plug it in.</w:t>
+      </w:r>
+    </w:p>
+    <w:p>
+      <w:pPr>
+        <w:ind w:left="280"/>
+        <w:spacing w:after="50" w:before="0" w:line="245"/>
+      </w:pPr>
+      <w:r>
+        <w:rPr>
+          <w:rFonts w:ascii="Calibri" w:cs="Calibri" w:eastAsia="Calibri" w:hAnsi="Calibri"/>
+          <w:b/>
+          <w:bCs/>
+          <w:sz w:val="17"/>
+          <w:szCs w:val="17"/>
+        </w:rPr>
+        <w:t xml:space="preserve">10.</w:t>
+      </w:r>
+      <w:r>
+        <w:rPr>
+          <w:rFonts w:ascii="Calibri" w:cs="Calibri" w:eastAsia="Calibri" w:hAnsi="Calibri"/>
+          <w:sz w:val="17"/>
+          <w:szCs w:val="17"/>
+        </w:rPr>
+        <w:t xml:space="preserve">  Put the 50 g weight in the centre of the analyser. If the reading is between 49.995 and 50.000 the instrument does not need calibration. [CONFIRM] confirm this tolerance.</w:t>
+      </w:r>
+    </w:p>
+    <w:p>
+      <w:pPr>
+        <w:ind w:left="280"/>
+        <w:spacing w:after="50" w:before="0" w:line="245"/>
+      </w:pPr>
+      <w:r>
+        <w:rPr>
+          <w:rFonts w:ascii="Calibri" w:cs="Calibri" w:eastAsia="Calibri" w:hAnsi="Calibri"/>
+          <w:b/>
+          <w:bCs/>
+          <w:sz w:val="17"/>
+          <w:szCs w:val="17"/>
+        </w:rPr>
+        <w:t xml:space="preserve">11.</w:t>
+      </w:r>
+      <w:r>
+        <w:rPr>
+          <w:rFonts w:ascii="Calibri" w:cs="Calibri" w:eastAsia="Calibri" w:hAnsi="Calibri"/>
+          <w:sz w:val="17"/>
+          <w:szCs w:val="17"/>
+        </w:rPr>
+        <w:t xml:space="preserve">  If it does not read within this range: press the program button for 3 seconds until 'CH' shows, then press program once more until 'CAL' shows.</w:t>
+      </w:r>
+    </w:p>
+    <w:p>
+      <w:pPr>
+        <w:ind w:left="280"/>
+        <w:spacing w:after="50" w:before="0" w:line="245"/>
+      </w:pPr>
+      <w:r>
+        <w:rPr>
+          <w:rFonts w:ascii="Calibri" w:cs="Calibri" w:eastAsia="Calibri" w:hAnsi="Calibri"/>
+          <w:b/>
+          <w:bCs/>
+          <w:sz w:val="17"/>
+          <w:szCs w:val="17"/>
+        </w:rPr>
+        <w:t xml:space="preserve">12.</w:t>
+      </w:r>
+      <w:r>
+        <w:rPr>
+          <w:rFonts w:ascii="Calibri" w:cs="Calibri" w:eastAsia="Calibri" w:hAnsi="Calibri"/>
+          <w:sz w:val="17"/>
+          <w:szCs w:val="17"/>
+        </w:rPr>
+        <w:t xml:space="preserve">  Press enter until 'CAL 0' shows, wait 20 seconds, then press enter again until '20' shows.</w:t>
+      </w:r>
+    </w:p>
+    <w:p>
+      <w:pPr>
+        <w:ind w:left="280"/>
+        <w:spacing w:after="50" w:before="0" w:line="245"/>
+      </w:pPr>
+      <w:r>
+        <w:rPr>
+          <w:rFonts w:ascii="Calibri" w:cs="Calibri" w:eastAsia="Calibri" w:hAnsi="Calibri"/>
+          <w:b/>
+          <w:bCs/>
+          <w:sz w:val="17"/>
+          <w:szCs w:val="17"/>
+        </w:rPr>
+        <w:t xml:space="preserve">13.</w:t>
+      </w:r>
+      <w:r>
+        <w:rPr>
+          <w:rFonts w:ascii="Calibri" w:cs="Calibri" w:eastAsia="Calibri" w:hAnsi="Calibri"/>
+          <w:sz w:val="17"/>
+          <w:szCs w:val="17"/>
+        </w:rPr>
+        <w:t xml:space="preserve">  Put the 20 g standard in the centre and press enter. Wait for 'End', then take the weight out.</w:t>
+      </w:r>
+    </w:p>
+    <w:p>
+      <w:pPr>
+        <w:ind w:left="280"/>
+        <w:spacing w:after="50" w:before="0" w:line="245"/>
+      </w:pPr>
+      <w:r>
+        <w:rPr>
+          <w:rFonts w:ascii="Calibri" w:cs="Calibri" w:eastAsia="Calibri" w:hAnsi="Calibri"/>
+          <w:b/>
+          <w:bCs/>
+          <w:sz w:val="17"/>
+          <w:szCs w:val="17"/>
+        </w:rPr>
+        <w:t xml:space="preserve">14.</w:t>
+      </w:r>
+      <w:r>
+        <w:rPr>
+          <w:rFonts w:ascii="Calibri" w:cs="Calibri" w:eastAsia="Calibri" w:hAnsi="Calibri"/>
+          <w:sz w:val="17"/>
+          <w:szCs w:val="17"/>
+        </w:rPr>
+        <w:t xml:space="preserve">  Test again with the 50 g weight. If the reading is between 49.995 and 50.000 the instrument is ready for use. If it is still outside, escalate to the supervisor for advice on repair or replacing a part.</w:t>
+      </w:r>
+    </w:p>
+    <w:p>
+      <w:pPr>
+        <w:ind w:left="280"/>
+        <w:spacing w:after="50" w:before="0" w:line="245"/>
+      </w:pPr>
+      <w:r>
+        <w:rPr>
+          <w:rFonts w:ascii="Calibri" w:cs="Calibri" w:eastAsia="Calibri" w:hAnsi="Calibri"/>
+          <w:b/>
+          <w:bCs/>
+          <w:sz w:val="17"/>
+          <w:szCs w:val="17"/>
+        </w:rPr>
+        <w:t xml:space="preserve">15.</w:t>
+      </w:r>
+      <w:r>
+        <w:rPr>
+          <w:rFonts w:ascii="Calibri" w:cs="Calibri" w:eastAsia="Calibri" w:hAnsi="Calibri"/>
+          <w:sz w:val="17"/>
+          <w:szCs w:val="17"/>
+        </w:rPr>
+        <w:t xml:space="preserve">  Record the results before and after in 'G:\Processing\5. Metallurgy\Metallurgy Lab\04 Metlab Data\Calibration Logsheet\Filtration Plant Moisture Analyzer Calibration.xlsx'. Report the data to the Met Lab supervisor or the metallurgist for review and approval.</w:t>
+      </w:r>
+    </w:p>
+    <w:p>
+      <w:pPr>
+        <w:ind w:left="280"/>
+        <w:spacing w:after="50" w:before="0" w:line="245"/>
+      </w:pPr>
+      <w:r>
+        <w:rPr>
+          <w:rFonts w:ascii="Calibri" w:cs="Calibri" w:eastAsia="Calibri" w:hAnsi="Calibri"/>
+          <w:b/>
+          <w:bCs/>
+          <w:sz w:val="17"/>
+          <w:szCs w:val="17"/>
+        </w:rPr>
+        <w:t xml:space="preserve">16.</w:t>
+      </w:r>
+      <w:r>
+        <w:rPr>
+          <w:rFonts w:ascii="Calibri" w:cs="Calibri" w:eastAsia="Calibri" w:hAnsi="Calibri"/>
+          <w:sz w:val="17"/>
+          <w:szCs w:val="17"/>
+        </w:rPr>
+        <w:t xml:space="preserve">  Per cent moisture verification: wear safety glasses, an N95 mask and latex gloves. Check the analyser is fit for use and plug it in.</w:t>
+      </w:r>
+    </w:p>
+    <w:p>
+      <w:pPr>
+        <w:ind w:left="280"/>
+        <w:spacing w:after="50" w:before="0" w:line="245"/>
+      </w:pPr>
+      <w:r>
+        <w:rPr>
+          <w:rFonts w:ascii="Calibri" w:cs="Calibri" w:eastAsia="Calibri" w:hAnsi="Calibri"/>
+          <w:b/>
+          <w:bCs/>
+          <w:sz w:val="17"/>
+          <w:szCs w:val="17"/>
+        </w:rPr>
+        <w:t xml:space="preserve">17.</w:t>
+      </w:r>
+      <w:r>
+        <w:rPr>
+          <w:rFonts w:ascii="Calibri" w:cs="Calibri" w:eastAsia="Calibri" w:hAnsi="Calibri"/>
+          <w:sz w:val="17"/>
+          <w:szCs w:val="17"/>
+        </w:rPr>
+        <w:t xml:space="preserve">  Press 'select' and choose standard mode 'STD'. Press select again and choose the method 'MID' with the arrows. Press select and set the temperature to 160 degrees C.</w:t>
+      </w:r>
+    </w:p>
+    <w:p>
+      <w:pPr>
+        <w:ind w:left="280"/>
+        <w:spacing w:after="50" w:before="0" w:line="245"/>
+      </w:pPr>
+      <w:r>
+        <w:rPr>
+          <w:rFonts w:ascii="Calibri" w:cs="Calibri" w:eastAsia="Calibri" w:hAnsi="Calibri"/>
+          <w:b/>
+          <w:bCs/>
+          <w:sz w:val="17"/>
+          <w:szCs w:val="17"/>
+        </w:rPr>
+        <w:t xml:space="preserve">18.</w:t>
+      </w:r>
+      <w:r>
+        <w:rPr>
+          <w:rFonts w:ascii="Calibri" w:cs="Calibri" w:eastAsia="Calibri" w:hAnsi="Calibri"/>
+          <w:sz w:val="17"/>
+          <w:szCs w:val="17"/>
+        </w:rPr>
+        <w:t xml:space="preserve">  Press enter and pour sodium tartrate dihydrate into the pan to 5 g. Close the cover, press start, and wait until the moisture analysis is finished.</w:t>
+      </w:r>
+    </w:p>
+    <w:p>
+      <w:pPr>
+        <w:ind w:left="280"/>
+        <w:spacing w:after="50" w:before="0" w:line="245"/>
+      </w:pPr>
+      <w:r>
+        <w:rPr>
+          <w:rFonts w:ascii="Calibri" w:cs="Calibri" w:eastAsia="Calibri" w:hAnsi="Calibri"/>
+          <w:b/>
+          <w:bCs/>
+          <w:sz w:val="17"/>
+          <w:szCs w:val="17"/>
+        </w:rPr>
+        <w:t xml:space="preserve">19.</w:t>
+      </w:r>
+      <w:r>
+        <w:rPr>
+          <w:rFonts w:ascii="Calibri" w:cs="Calibri" w:eastAsia="Calibri" w:hAnsi="Calibri"/>
+          <w:sz w:val="17"/>
+          <w:szCs w:val="17"/>
+        </w:rPr>
+        <w:t xml:space="preserve">  Record the result before and after verification in the same logsheet and report it for review. [CONFIRM] the source gives no acceptance value. Sodium tartrate dihydrate holds about 15.7 per cent water by mass (15.66 per cent theoretical); set a tolerance against that.</w:t>
       </w:r>
     </w:p>
     <w:p>
@@ -2141,6 +2611,24 @@
           <w:szCs w:val="17"/>
         </w:rPr>
         <w:t xml:space="preserve">KBK-MIR-MP-PRO-MET-SOP-0032 Moisture Content, Bahasa master received 11 Aug 2026</w:t>
+      </w:r>
+    </w:p>
+    <w:p>
+      <w:pPr>
+        <w:pStyle w:val="ListParagraph"/>
+        <w:numPr>
+          <w:ilvl w:val="0"/>
+          <w:numId w:val="1"/>
+        </w:numPr>
+        <w:spacing w:after="60" w:line="245"/>
+      </w:pPr>
+      <w:r>
+        <w:rPr>
+          <w:rFonts w:ascii="Calibri" w:cs="Calibri" w:eastAsia="Calibri" w:hAnsi="Calibri"/>
+          <w:sz w:val="17"/>
+          <w:szCs w:val="17"/>
+        </w:rPr>
+        <w:t xml:space="preserve">Martabe work instruction 'A&amp;D MS-70 Moisture Analyzer Calibration' DOC-3-MET-PMC-WIN-00121-IE v1.0 (issued 25/12/2024) - Part B source</w:t>
       </w:r>
     </w:p>
     <w:sectPr>

</xml_diff>